<commit_message>
docs: SSH key setup walkthrough -- show interactive ssh-keygen prompts
Appendix A reorganised as a 4-step sequence (generate -> gh login ->
upload -> verify), with the exact prompts ssh-keygen displays
('Enter file in which to save the key', 'Enter passphrase') so users
on a fresh Windows machine know to just press Enter at each. Mirrors
the recovery flow the migrate-to-2026-05.ps1 error message now prints,
and addresses the most common stumbling block when running the
migration on a never-before-set-up Windows box.
</commit_message>
<xml_diff>
--- a/docs/install-routines.docx
+++ b/docs/install-routines.docx
@@ -3448,6 +3448,33 @@
     </w:p>
     <w:p>
       <w:pPr>
+        <w:spacing w:before="80" w:after="80"/>
+        <w:ind w:left="567"/>
+      </w:pPr>
+      <w:r>
+        <w:rPr>
+          <w:rFonts w:ascii="Arial" w:hAnsi="Arial"/>
+          <w:b w:val="0"/>
+          <w:i/>
+          <w:color w:val="005A6C"/>
+          <w:sz w:val="18"/>
+        </w:rPr>
+        <w:t>*The full sequence is four small commands.* All install/update/migrate scripts assume this is already done. If `ssh -T git@github.com` fails with `Permission denied (publickey)`, walk through this appendix once and you're set.</w:t>
+      </w:r>
+    </w:p>
+    <w:p>
+      <w:pPr>
+        <w:pStyle w:val="Heading3"/>
+        <w:keepNext/>
+        <w:keepLines/>
+        <w:spacing w:before="240" w:after="120"/>
+      </w:pPr>
+      <w:r>
+        <w:t>Step 1 — Generate a key (skip if `~/.ssh/id_ed25519` already exists)</w:t>
+      </w:r>
+    </w:p>
+    <w:p>
+      <w:pPr>
         <w:pStyle w:val="TTCbodycopyTTC"/>
       </w:pPr>
       <w:r/>
@@ -3455,7 +3482,7 @@
         <w:rPr>
           <w:b/>
         </w:rPr>
-        <w:t>Generate key (if you don't have one):</w:t>
+        <w:t>macOS / Linux:</w:t>
       </w:r>
       <w:r/>
     </w:p>
@@ -3471,25 +3498,80 @@
           <w:color w:val="25415C"/>
           <w:sz w:val="16"/>
         </w:rPr>
-        <w:t># macOS / Linux:</w:t>
-      </w:r>
+        <w:t>ssh-keygen -t ed25519 -C "$USER@$(hostname -s)"</w:t>
+      </w:r>
+    </w:p>
+    <w:p>
+      <w:pPr>
+        <w:pStyle w:val="TTCbodycopyTTC"/>
+      </w:pPr>
+      <w:r/>
+      <w:r>
+        <w:rPr>
+          <w:b/>
+        </w:rPr>
+        <w:t>Windows (PowerShell):</w:t>
+      </w:r>
+      <w:r/>
+    </w:p>
+    <w:p>
+      <w:pPr>
+        <w:spacing w:before="120" w:after="120"/>
+        <w:ind w:left="567"/>
+        <w:shd w:val="clear" w:color="auto" w:fill="E9EDF0"/>
+      </w:pPr>
       <w:r>
         <w:rPr>
           <w:rFonts w:ascii="Courier New" w:hAnsi="Courier New"/>
           <w:color w:val="25415C"/>
           <w:sz w:val="16"/>
         </w:rPr>
-        <w:br/>
-        <w:t>ssh-keygen -t ed25519 -C "$USER@$(hostname -s)"</w:t>
-      </w:r>
+        <w:t>ssh-keygen -t ed25519 -C "$env:USERNAME@$env:COMPUTERNAME"</w:t>
+      </w:r>
+    </w:p>
+    <w:p>
+      <w:pPr>
+        <w:pStyle w:val="TTCbodycopyTTC"/>
+      </w:pPr>
+      <w:r/>
+      <w:r>
+        <w:rPr>
+          <w:b/>
+        </w:rPr>
+        <w:t>What ssh-keygen will ask you (identical on all platforms):</w:t>
+      </w:r>
+      <w:r/>
+    </w:p>
+    <w:p>
+      <w:pPr>
+        <w:spacing w:before="120" w:after="120"/>
+        <w:ind w:left="567"/>
+        <w:shd w:val="clear" w:color="auto" w:fill="E9EDF0"/>
+      </w:pPr>
       <w:r>
         <w:rPr>
           <w:rFonts w:ascii="Courier New" w:hAnsi="Courier New"/>
           <w:color w:val="25415C"/>
           <w:sz w:val="16"/>
         </w:rPr>
-        <w:br/>
-        <w:t># accept default path; passphrase optional but recommended</w:t>
+        <w:t>Enter file in which to save the key (C:\Users\&lt;you&gt;/.ssh/id_ed25519):</w:t>
+      </w:r>
+    </w:p>
+    <w:p>
+      <w:pPr>
+        <w:pStyle w:val="TTCbodycopyTTC"/>
+      </w:pPr>
+      <w:r>
+        <w:t xml:space="preserve">→ </w:t>
+      </w:r>
+      <w:r>
+        <w:rPr>
+          <w:b/>
+        </w:rPr>
+        <w:t>Press Enter</w:t>
+      </w:r>
+      <w:r>
+        <w:t xml:space="preserve"> to accept the default path. Don't type anything else here — every other tool expects the key at the default location.</w:t>
       </w:r>
     </w:p>
     <w:p>
@@ -3504,7 +3586,7 @@
           <w:color w:val="25415C"/>
           <w:sz w:val="16"/>
         </w:rPr>
-        <w:t># Windows:</w:t>
+        <w:t>Enter passphrase (empty for no passphrase):</w:t>
       </w:r>
       <w:r>
         <w:rPr>
@@ -3513,21 +3595,33 @@
           <w:sz w:val="16"/>
         </w:rPr>
         <w:br/>
-        <w:t>ssh-keygen -t ed25519 -C "$env:USERNAME@$env:COMPUTERNAME"</w:t>
-      </w:r>
-    </w:p>
-    <w:p>
-      <w:pPr>
-        <w:pStyle w:val="TTCbodycopyTTC"/>
-      </w:pPr>
-      <w:r/>
+        <w:t>Enter same passphrase again:</w:t>
+      </w:r>
+    </w:p>
+    <w:p>
+      <w:pPr>
+        <w:pStyle w:val="TTCbodycopyTTC"/>
+      </w:pPr>
+      <w:r>
+        <w:t xml:space="preserve">→ </w:t>
+      </w:r>
       <w:r>
         <w:rPr>
           <w:b/>
         </w:rPr>
-        <w:t>Upload to GitHub:</w:t>
-      </w:r>
-      <w:r/>
+        <w:t>Press Enter twice</w:t>
+      </w:r>
+      <w:r>
+        <w:t xml:space="preserve"> for no passphrase (simplest). Optional: set a passphrase for an extra layer of protection — you'll then be asked for it on each git push/pull unless you load it into your OS keychain via `ssh-add`.</w:t>
+      </w:r>
+    </w:p>
+    <w:p>
+      <w:pPr>
+        <w:pStyle w:val="TTCbodycopyTTC"/>
+      </w:pPr>
+      <w:r>
+        <w:t>You'll see confirmation:</w:t>
+      </w:r>
     </w:p>
     <w:p>
       <w:pPr>
@@ -3541,7 +3635,7 @@
           <w:color w:val="25415C"/>
           <w:sz w:val="16"/>
         </w:rPr>
-        <w:t># macOS / Linux:</w:t>
+        <w:t>Your identification has been saved in C:\Users\&lt;you&gt;\.ssh\id_ed25519</w:t>
       </w:r>
       <w:r>
         <w:rPr>
@@ -3550,7 +3644,27 @@
           <w:sz w:val="16"/>
         </w:rPr>
         <w:br/>
-        <w:t>gh ssh-key add ~/.ssh/id_ed25519.pub --title "$USER@$(hostname -s) ($(date +%Y-%m))"</w:t>
+        <w:t>Your public key has been saved in C:\Users\&lt;you&gt;\.ssh\id_ed25519.pub</w:t>
+      </w:r>
+      <w:r>
+        <w:rPr>
+          <w:rFonts w:ascii="Courier New" w:hAnsi="Courier New"/>
+          <w:color w:val="25415C"/>
+          <w:sz w:val="16"/>
+        </w:rPr>
+        <w:br/>
+        <w:t>The key fingerprint is: SHA256:&lt;hash&gt; ...</w:t>
+      </w:r>
+    </w:p>
+    <w:p>
+      <w:pPr>
+        <w:pStyle w:val="Heading3"/>
+        <w:keepNext/>
+        <w:keepLines/>
+        <w:spacing w:before="240" w:after="120"/>
+      </w:pPr>
+      <w:r>
+        <w:t>Step 2 — Make sure gh CLI is logged in</w:t>
       </w:r>
     </w:p>
     <w:p>
@@ -3565,25 +3679,77 @@
           <w:color w:val="25415C"/>
           <w:sz w:val="16"/>
         </w:rPr>
-        <w:t># Windows:</w:t>
-      </w:r>
+        <w:t>gh auth status</w:t>
+      </w:r>
+    </w:p>
+    <w:p>
+      <w:pPr>
+        <w:pStyle w:val="TTCbodycopyTTC"/>
+      </w:pPr>
+      <w:r>
+        <w:t>If it says "not logged in", run:</w:t>
+      </w:r>
+    </w:p>
+    <w:p>
+      <w:pPr>
+        <w:spacing w:before="120" w:after="120"/>
+        <w:ind w:left="567"/>
+        <w:shd w:val="clear" w:color="auto" w:fill="E9EDF0"/>
+      </w:pPr>
       <w:r>
         <w:rPr>
           <w:rFonts w:ascii="Courier New" w:hAnsi="Courier New"/>
           <w:color w:val="25415C"/>
           <w:sz w:val="16"/>
         </w:rPr>
-        <w:br/>
-        <w:t>gh ssh-key add "$env:USERPROFILE\.ssh\id_ed25519.pub" `</w:t>
-      </w:r>
+        <w:t>gh auth login --hostname github.com --git-protocol ssh --web</w:t>
+      </w:r>
+    </w:p>
+    <w:p>
+      <w:pPr>
+        <w:pStyle w:val="TTCbodycopyTTC"/>
+      </w:pPr>
+      <w:r>
+        <w:t>Follow the device-code flow in your browser.</w:t>
+      </w:r>
+    </w:p>
+    <w:p>
+      <w:pPr>
+        <w:pStyle w:val="Heading3"/>
+        <w:keepNext/>
+        <w:keepLines/>
+        <w:spacing w:before="240" w:after="120"/>
+      </w:pPr>
+      <w:r>
+        <w:t>Step 3 — Upload the public key to GitHub</w:t>
+      </w:r>
+    </w:p>
+    <w:p>
+      <w:pPr>
+        <w:pStyle w:val="TTCbodycopyTTC"/>
+      </w:pPr>
+      <w:r/>
+      <w:r>
+        <w:rPr>
+          <w:b/>
+        </w:rPr>
+        <w:t>macOS / Linux:</w:t>
+      </w:r>
+      <w:r/>
+    </w:p>
+    <w:p>
+      <w:pPr>
+        <w:spacing w:before="120" w:after="120"/>
+        <w:ind w:left="567"/>
+        <w:shd w:val="clear" w:color="auto" w:fill="E9EDF0"/>
+      </w:pPr>
       <w:r>
         <w:rPr>
           <w:rFonts w:ascii="Courier New" w:hAnsi="Courier New"/>
           <w:color w:val="25415C"/>
           <w:sz w:val="16"/>
         </w:rPr>
-        <w:br/>
-        <w:t xml:space="preserve">  --title "$env:USERNAME@$env:COMPUTERNAME ($(Get-Date -Format 'yyyy-MM'))"</w:t>
+        <w:t>gh ssh-key add ~/.ssh/id_ed25519.pub --title "$USER@$(hostname -s) ($(date +%Y-%m))"</w:t>
       </w:r>
     </w:p>
     <w:p>
@@ -3595,7 +3761,7 @@
         <w:rPr>
           <w:b/>
         </w:rPr>
-        <w:t>Verify:</w:t>
+        <w:t>Windows (PowerShell):</w:t>
       </w:r>
       <w:r/>
     </w:p>
@@ -3611,7 +3777,7 @@
           <w:color w:val="25415C"/>
           <w:sz w:val="16"/>
         </w:rPr>
-        <w:t>ssh -T git@github.com</w:t>
+        <w:t>gh ssh-key add "$env:USERPROFILE\.ssh\id_ed25519.pub" `</w:t>
       </w:r>
       <w:r>
         <w:rPr>
@@ -3620,31 +3786,99 @@
           <w:sz w:val="16"/>
         </w:rPr>
         <w:br/>
-        <w:t># Expected: "Hi &lt;user&gt;! You've successfully authenticated, but GitHub does not provide shell access."</w:t>
-      </w:r>
+        <w:t xml:space="preserve">  --title "$env:USERNAME@$env:COMPUTERNAME ($(Get-Date -Format 'yyyy-MM'))"</w:t>
+      </w:r>
+    </w:p>
+    <w:p>
+      <w:pPr>
+        <w:pStyle w:val="Heading3"/>
+        <w:keepNext/>
+        <w:keepLines/>
+        <w:spacing w:before="240" w:after="120"/>
+      </w:pPr>
+      <w:r>
+        <w:t>Step 4 — Verify</w:t>
+      </w:r>
+    </w:p>
+    <w:p>
+      <w:pPr>
+        <w:spacing w:before="120" w:after="120"/>
+        <w:ind w:left="567"/>
+        <w:shd w:val="clear" w:color="auto" w:fill="E9EDF0"/>
+      </w:pPr>
       <w:r>
         <w:rPr>
           <w:rFonts w:ascii="Courier New" w:hAnsi="Courier New"/>
           <w:color w:val="25415C"/>
           <w:sz w:val="16"/>
         </w:rPr>
-        <w:br/>
-        <w:t># Exit code 1 is normal here.</w:t>
-      </w:r>
-    </w:p>
-    <w:p>
-      <w:pPr>
-        <w:pStyle w:val="TTCbodycopyTTC"/>
-      </w:pPr>
-      <w:r/>
-      <w:r>
-        <w:rPr>
-          <w:b/>
-        </w:rPr>
-        <w:t>Convention for SSH key titles:</w:t>
-      </w:r>
-      <w:r>
-        <w:t xml:space="preserve"> `&lt;user&gt;@&lt;machine&gt; (YYYY-MM)`. Example: `joerg@Mac-mini (2026-05)`. The date stamp lets you spot stale keys when rotating.</w:t>
+        <w:t>ssh -T git@github.com</w:t>
+      </w:r>
+    </w:p>
+    <w:p>
+      <w:pPr>
+        <w:pStyle w:val="TTCbodycopyTTC"/>
+      </w:pPr>
+      <w:r>
+        <w:t>Expected output:</w:t>
+      </w:r>
+    </w:p>
+    <w:p>
+      <w:pPr>
+        <w:spacing w:before="120" w:after="120"/>
+        <w:ind w:left="567"/>
+        <w:shd w:val="clear" w:color="auto" w:fill="E9EDF0"/>
+      </w:pPr>
+      <w:r>
+        <w:rPr>
+          <w:rFonts w:ascii="Courier New" w:hAnsi="Courier New"/>
+          <w:color w:val="25415C"/>
+          <w:sz w:val="16"/>
+        </w:rPr>
+        <w:t>Hi &lt;your-github-user&gt;! You've successfully authenticated, but GitHub does not provide shell access.</w:t>
+      </w:r>
+    </w:p>
+    <w:p>
+      <w:pPr>
+        <w:spacing w:before="80" w:after="80"/>
+        <w:ind w:left="567"/>
+      </w:pPr>
+      <w:r>
+        <w:rPr>
+          <w:rFonts w:ascii="Arial" w:hAnsi="Arial"/>
+          <w:b w:val="0"/>
+          <w:i/>
+          <w:color w:val="005A6C"/>
+          <w:sz w:val="18"/>
+        </w:rPr>
+        <w:t>*Exit code 1 is normal here* — GitHub closes the connection right after the auth banner because it doesn't grant shell access. The success line is what matters.</w:t>
+      </w:r>
+    </w:p>
+    <w:p>
+      <w:pPr>
+        <w:pStyle w:val="TTCbodycopyTTC"/>
+      </w:pPr>
+      <w:r>
+        <w:t>If you instead see `Permission denied (publickey)`, the key isn't reaching GitHub yet — re-check Steps 1–3.</w:t>
+      </w:r>
+    </w:p>
+    <w:p>
+      <w:pPr>
+        <w:pStyle w:val="Heading3"/>
+        <w:keepNext/>
+        <w:keepLines/>
+        <w:spacing w:before="240" w:after="120"/>
+      </w:pPr>
+      <w:r>
+        <w:t>Convention for SSH key titles</w:t>
+      </w:r>
+    </w:p>
+    <w:p>
+      <w:pPr>
+        <w:pStyle w:val="TTCbodycopyTTC"/>
+      </w:pPr>
+      <w:r>
+        <w:t>`&lt;user&gt;@&lt;machine&gt; (YYYY-MM)`. Examples: `joerg@Mac-mini (2026-05)`, `joerg@DESKTOP-X7K2 (2026-05)`. The date stamp lets you spot stale keys when rotating.</w:t>
       </w:r>
     </w:p>
     <w:p>

</xml_diff>